<commit_message>
Apply patch 20260530_170505: 登录态UX优化+文件头规范+gitignore
</commit_message>
<xml_diff>
--- a/soundproof-agent/docs/隔音窗专家咨询与购物辅助Agent系统-项目需求文档-V1.docx
+++ b/soundproof-agent/docs/隔音窗专家咨询与购物辅助Agent系统-项目需求文档-V1.docx
@@ -8750,6 +8750,48 @@
       </w:pPr>
       <w:r>
         <w:t>统一日志：logging模块，同时输出控制台与文件，异常必须记录完整堆栈</w:t>
+      </w:r>
+    </w:p>
+    <w:p>
+      <w:pPr/>
+      <w:r>
+        <w:t>【V1 实际实现现状（2026-05-30 第五次同步）— 代码质量标准】</w:t>
+      </w:r>
+    </w:p>
+    <w:p>
+      <w:pPr/>
+      <w:r>
+        <w:t>✅ 文件头部注释规范在所有新文件中遵守（见 docs/ONBOARDING_CHECKLIST.md 第 7 步）。</w:t>
+      </w:r>
+    </w:p>
+    <w:p>
+      <w:pPr/>
+      <w:r>
+        <w:t>✅ 2026-05-30 第五次升级文件头规范（用户硬性要求）：必须写具体大模型名（如 Claude Sonnet 4.5 (via Arena.ai Agent Mode) / GPT-5 Pro (via Arena.ai Agent Mode) / Gemini 2.5 Pro (via Arena.ai Agent Mode) 等），不能只写笼统的 "Arena.ai Agent Mode"，否则无法追溯责任。</w:t>
+      </w:r>
+    </w:p>
+    <w:p>
+      <w:pPr/>
+      <w:r>
+        <w:t>✅ 新增文件用：# 创建该文件的LLM大模型：&lt;名&gt; / # 创建时间（北京时间，精确到秒）：YYYY-MM-DD HH:MM:SS CST。</w:t>
+      </w:r>
+    </w:p>
+    <w:p>
+      <w:pPr/>
+      <w:r>
+        <w:t>✅ 修改文件用：# 修改该文件的LLM大模型：&lt;名&gt; / # 最后修改时间... 并维护「修改记录」小段（最新在最上）。</w:t>
+      </w:r>
+    </w:p>
+    <w:p>
+      <w:pPr/>
+      <w:r>
+        <w:t>✅ 类型注解 / 中文 docstring / 抽象接口（ShoppingExecutorInterface）。</w:t>
+      </w:r>
+    </w:p>
+    <w:p>
+      <w:pPr/>
+      <w:r>
+        <w:t>🟡 统一日志：基础 logging 已用，未做完整双输出 + 滚动配置。</w:t>
       </w:r>
     </w:p>
     <w:p>

</xml_diff>